<commit_message>
style(docx): reduce header logo and reclaim top whitespace for clean 8-page fit
</commit_message>
<xml_diff>
--- a/NEW-APPLICATION-FORMAT-1.docx
+++ b/NEW-APPLICATION-FORMAT-1.docx
@@ -23365,9 +23365,9 @@
                 <wp:posOffset>4326255</wp:posOffset>
               </wp:positionH>
               <wp:positionV relativeFrom="paragraph">
-                <wp:posOffset>345440</wp:posOffset>
+                <wp:posOffset>130000</wp:posOffset>
               </wp:positionV>
-              <wp:extent cx="2286000" cy="312420"/>
+              <wp:extent cx="1950000" cy="260000"/>
               <wp:effectExtent l="0" t="0" r="19050" b="11430"/>
               <wp:wrapNone/>
               <wp:docPr id="3" name=" 1"/>
@@ -23383,7 +23383,7 @@
                     <wps:spPr bwMode="auto">
                       <a:xfrm>
                         <a:off x="0" y="0"/>
-                        <a:ext cx="2286000" cy="312420"/>
+                        <a:ext cx="1950000" cy="260000"/>
                       </a:xfrm>
                       <a:prstGeom prst="roundRect">
                         <a:avLst>
@@ -23440,7 +23440,7 @@
         </mc:Choice>
         <mc:Fallback>
           <w:pict>
-            <v:roundrect w14:anchorId="30A99EFF" id=" 1" o:spid="_x0000_s1027" style="position:absolute;margin-left:340.65pt;margin-top:27.2pt;width:180pt;height:24.6pt;z-index:251657728;visibility:visible;mso-wrap-style:square;mso-width-percent:0;mso-height-percent:0;mso-wrap-distance-left:9pt;mso-wrap-distance-top:0;mso-wrap-distance-right:9pt;mso-wrap-distance-bottom:0;mso-position-horizontal:absolute;mso-position-horizontal-relative:text;mso-position-vertical:absolute;mso-position-vertical-relative:text;mso-width-percent:0;mso-height-percent:0;mso-width-relative:page;mso-height-relative:page;v-text-anchor:top" arcsize="10923f" o:gfxdata="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">
+            <v:roundrect w14:anchorId="30A99EFF" id=" 1" o:spid="_x0000_s1027" style="position:absolute;margin-left:340.65pt;margin-top:10pt;width:153pt;height:20pt;z-index:251657728;visibility:visible;mso-wrap-style:square;mso-width-percent:0;mso-height-percent:0;mso-wrap-distance-left:9pt;mso-wrap-distance-top:0;mso-wrap-distance-right:9pt;mso-wrap-distance-bottom:0;mso-position-horizontal:absolute;mso-position-horizontal-relative:text;mso-position-vertical:absolute;mso-position-vertical-relative:text;mso-width-percent:0;mso-height-percent:0;mso-width-relative:page;mso-height-relative:page;v-text-anchor:top" arcsize="10923f" o:gfxdata="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">
               <v:path arrowok="t"/>
               <v:textbox>
                 <w:txbxContent>
@@ -23475,7 +23475,7 @@
       </w:rPr>
       <w:drawing>
         <wp:inline distT="0" distB="0" distL="0" distR="0" wp14:anchorId="5DA068E0" wp14:editId="52530951">
-          <wp:extent cx="2919591" cy="1019175"/>
+          <wp:extent cx="2050000" cy="715000"/>
           <wp:effectExtent l="0" t="0" r="0" b="0"/>
           <wp:docPr id="2" name="Picture 1"/>
           <wp:cNvGraphicFramePr>
@@ -23505,7 +23505,7 @@
                 <pic:spPr bwMode="auto">
                   <a:xfrm>
                     <a:off x="0" y="0"/>
-                    <a:ext cx="2919591" cy="1019175"/>
+                    <a:ext cx="2050000" cy="715000"/>
                   </a:xfrm>
                   <a:prstGeom prst="rect">
                     <a:avLst/>

</xml_diff>

<commit_message>
fix(docx): expand Medical History row (b) and (e) height so text does not touch cell bottom border
</commit_message>
<xml_diff>
--- a/NEW-APPLICATION-FORMAT-1.docx
+++ b/NEW-APPLICATION-FORMAT-1.docx
@@ -3650,7 +3650,7 @@
       </w:tr>
       <w:tr>
         <w:trPr>
-          <w:trHeight w:hRule="exact" w:val="478"/>
+          <w:trHeight w:hRule="atLeast" w:val="580"/>
         </w:trPr>
         <w:tc>
           <w:tcPr>
@@ -3666,6 +3666,7 @@
               <w:rPr>
                 <w:rFonts w:ascii="Arial Narrow" w:hAnsi="Arial Narrow" w:cs="Arial"/>
               </w:rPr>
+              <w:spacing w:before="40" w:after="40" w:line="220" w:lineRule="auto"/>
             </w:pPr>
             <w:r>
               <w:rPr>
@@ -4110,7 +4111,7 @@
       </w:tr>
       <w:tr>
         <w:trPr>
-          <w:trHeight w:hRule="exact" w:val="288"/>
+          <w:trHeight w:hRule="atLeast" w:val="340"/>
         </w:trPr>
         <w:tc>
           <w:tcPr>

</xml_diff>

<commit_message>
fix(docx): expand Page 5 Table 6 row heights so wrapped course titles like BRIDGE RESOURCE MANAGEMENT are fully visible
</commit_message>
<xml_diff>
--- a/NEW-APPLICATION-FORMAT-1.docx
+++ b/NEW-APPLICATION-FORMAT-1.docx
@@ -13461,7 +13461,7 @@
       </w:tblGrid>
       <w:tr>
         <w:trPr>
-          <w:trHeight w:val="297"/>
+          <w:trHeight w:val="320" w:hRule="atLeast"/>
         </w:trPr>
         <w:tc>
           <w:tcPr>
@@ -13503,7 +13503,7 @@
       </w:tr>
       <w:tr>
         <w:trPr>
-          <w:trHeight w:val="297"/>
+          <w:trHeight w:val="320" w:hRule="atLeast"/>
         </w:trPr>
         <w:tc>
           <w:tcPr>
@@ -13648,7 +13648,7 @@
       </w:tr>
       <w:tr>
         <w:trPr>
-          <w:trHeight w:val="297"/>
+          <w:trHeight w:val="320" w:hRule="atLeast"/>
         </w:trPr>
         <w:tc>
           <w:tcPr>
@@ -13751,7 +13751,7 @@
       </w:tr>
       <w:tr>
         <w:trPr>
-          <w:trHeight w:val="297"/>
+          <w:trHeight w:val="320" w:hRule="atLeast"/>
         </w:trPr>
         <w:tc>
           <w:tcPr>
@@ -13855,7 +13855,7 @@
       </w:tr>
       <w:tr>
         <w:trPr>
-          <w:trHeight w:val="297"/>
+          <w:trHeight w:val="320" w:hRule="atLeast"/>
         </w:trPr>
         <w:tc>
           <w:tcPr>
@@ -13958,7 +13958,7 @@
       </w:tr>
       <w:tr>
         <w:trPr>
-          <w:trHeight w:val="297"/>
+          <w:trHeight w:val="320" w:hRule="atLeast"/>
         </w:trPr>
         <w:tc>
           <w:tcPr>
@@ -14061,7 +14061,7 @@
       </w:tr>
       <w:tr>
         <w:trPr>
-          <w:trHeight w:val="297"/>
+          <w:trHeight w:val="320" w:hRule="atLeast"/>
         </w:trPr>
         <w:tc>
           <w:tcPr>
@@ -14164,7 +14164,7 @@
       </w:tr>
       <w:tr>
         <w:trPr>
-          <w:trHeight w:val="297"/>
+          <w:trHeight w:val="320" w:hRule="atLeast"/>
         </w:trPr>
         <w:tc>
           <w:tcPr>
@@ -14267,7 +14267,7 @@
       </w:tr>
       <w:tr>
         <w:trPr>
-          <w:trHeight w:val="297"/>
+          <w:trHeight w:val="320" w:hRule="atLeast"/>
         </w:trPr>
         <w:tc>
           <w:tcPr>
@@ -14372,7 +14372,7 @@
       </w:tr>
       <w:tr>
         <w:trPr>
-          <w:trHeight w:val="297"/>
+          <w:trHeight w:val="320" w:hRule="atLeast"/>
         </w:trPr>
         <w:tc>
           <w:tcPr>
@@ -14475,7 +14475,7 @@
       </w:tr>
       <w:tr>
         <w:trPr>
-          <w:trHeight w:val="297"/>
+          <w:trHeight w:val="460" w:hRule="atLeast"/>
         </w:trPr>
         <w:tc>
           <w:tcPr>
@@ -14592,7 +14592,7 @@
       </w:tr>
       <w:tr>
         <w:trPr>
-          <w:trHeight w:val="297"/>
+          <w:trHeight w:val="320" w:hRule="atLeast"/>
         </w:trPr>
         <w:tc>
           <w:tcPr>
@@ -14697,7 +14697,7 @@
       </w:tr>
       <w:tr>
         <w:trPr>
-          <w:trHeight w:val="297"/>
+          <w:trHeight w:val="320" w:hRule="atLeast"/>
         </w:trPr>
         <w:tc>
           <w:tcPr>
@@ -14807,7 +14807,7 @@
       </w:tr>
       <w:tr>
         <w:trPr>
-          <w:trHeight w:val="297"/>
+          <w:trHeight w:val="460" w:hRule="atLeast"/>
         </w:trPr>
         <w:tc>
           <w:tcPr>
@@ -14917,7 +14917,7 @@
       </w:tr>
       <w:tr>
         <w:trPr>
-          <w:trHeight w:val="297"/>
+          <w:trHeight w:val="320" w:hRule="atLeast"/>
         </w:trPr>
         <w:tc>
           <w:tcPr>
@@ -15027,7 +15027,7 @@
       </w:tr>
       <w:tr>
         <w:trPr>
-          <w:trHeight w:val="297"/>
+          <w:trHeight w:val="320" w:hRule="atLeast"/>
         </w:trPr>
         <w:tc>
           <w:tcPr>
@@ -15137,7 +15137,7 @@
       </w:tr>
       <w:tr>
         <w:trPr>
-          <w:trHeight w:val="125"/>
+          <w:trHeight w:val="460" w:hRule="atLeast"/>
         </w:trPr>
         <w:tc>
           <w:tcPr>
@@ -15261,7 +15261,7 @@
       </w:tr>
       <w:tr>
         <w:trPr>
-          <w:trHeight w:val="297"/>
+          <w:trHeight w:val="460" w:hRule="atLeast"/>
         </w:trPr>
         <w:tc>
           <w:tcPr>
@@ -15371,7 +15371,7 @@
       </w:tr>
       <w:tr>
         <w:trPr>
-          <w:trHeight w:val="297"/>
+          <w:trHeight w:val="460" w:hRule="atLeast"/>
         </w:trPr>
         <w:tc>
           <w:tcPr>
@@ -15488,7 +15488,7 @@
       </w:tr>
       <w:tr>
         <w:trPr>
-          <w:trHeight w:val="297"/>
+          <w:trHeight w:val="460" w:hRule="atLeast"/>
         </w:trPr>
         <w:tc>
           <w:tcPr>
@@ -15606,7 +15606,7 @@
       </w:tr>
       <w:tr>
         <w:trPr>
-          <w:trHeight w:val="297"/>
+          <w:trHeight w:val="320" w:hRule="atLeast"/>
         </w:trPr>
         <w:tc>
           <w:tcPr>
@@ -15716,7 +15716,7 @@
       </w:tr>
       <w:tr>
         <w:trPr>
-          <w:trHeight w:val="297"/>
+          <w:trHeight w:val="320" w:hRule="atLeast"/>
         </w:trPr>
         <w:tc>
           <w:tcPr>
@@ -15826,7 +15826,7 @@
       </w:tr>
       <w:tr>
         <w:trPr>
-          <w:trHeight w:val="297"/>
+          <w:trHeight w:val="460" w:hRule="atLeast"/>
         </w:trPr>
         <w:tc>
           <w:tcPr>
@@ -15936,7 +15936,7 @@
       </w:tr>
       <w:tr>
         <w:trPr>
-          <w:trHeight w:val="297"/>
+          <w:trHeight w:val="460" w:hRule="atLeast"/>
         </w:trPr>
         <w:tc>
           <w:tcPr>
@@ -16046,7 +16046,7 @@
       </w:tr>
       <w:tr>
         <w:trPr>
-          <w:trHeight w:val="297"/>
+          <w:trHeight w:val="460" w:hRule="atLeast"/>
         </w:trPr>
         <w:tc>
           <w:tcPr>
@@ -16156,7 +16156,7 @@
       </w:tr>
       <w:tr>
         <w:trPr>
-          <w:trHeight w:val="297"/>
+          <w:trHeight w:val="460" w:hRule="atLeast"/>
         </w:trPr>
         <w:tc>
           <w:tcPr>
@@ -16266,7 +16266,7 @@
       </w:tr>
       <w:tr>
         <w:trPr>
-          <w:trHeight w:val="297"/>
+          <w:trHeight w:val="320" w:hRule="atLeast"/>
         </w:trPr>
         <w:tc>
           <w:tcPr>
@@ -16383,7 +16383,7 @@
       </w:tr>
       <w:tr>
         <w:trPr>
-          <w:trHeight w:val="297"/>
+          <w:trHeight w:val="320" w:hRule="atLeast"/>
         </w:trPr>
         <w:tc>
           <w:tcPr>

</xml_diff>